<commit_message>
Didattica DiBEST: macroaree (Orientamento, Didattica, Calendari e risorse) con ingresso nel pannello per sezione e area a card; Calendari e risorse: aule, laboratori e sportelli prenotabili a slot con orari, chiusure, approvazione, ripetizione settimanale, email, promemoria, .ics, Area personale e agenda con CSV; campo scuola guidato (regione, provincia, comune, ricerca, scuola non in elenco); anagrafe degli insegnamenti e attività dei gruppi; nuovi modelli FSL di Convenzione e Allegato A precompilati; portale indipendente dalla cartella e migrazione a /didattica (schema v32)
</commit_message>
<xml_diff>
--- a/modelli_documenti/convenzione_precompilabile.docx
+++ b/modelli_documenti/convenzione_precompilabile.docx
@@ -33,7 +33,37 @@
           <w:szCs w:val="22"/>
           <w:lang w:eastAsia="en-US"/>
         </w:rPr>
-        <w:t>A.A. 2025/2026</w:t>
+        <w:t>A.A. 202</w:t>
+      </w:r>
+      <w:r>
+        <w:rPr>
+          <w:rFonts w:ascii="Calibri" w:eastAsia="Calibri" w:hAnsi="Calibri" w:cs="Calibri"/>
+          <w:b/>
+          <w:sz w:val="22"/>
+          <w:szCs w:val="22"/>
+          <w:lang w:eastAsia="en-US"/>
+        </w:rPr>
+        <w:t>6</w:t>
+      </w:r>
+      <w:r>
+        <w:rPr>
+          <w:rFonts w:ascii="Calibri" w:eastAsia="Calibri" w:hAnsi="Calibri" w:cs="Calibri"/>
+          <w:b/>
+          <w:sz w:val="22"/>
+          <w:szCs w:val="22"/>
+          <w:lang w:eastAsia="en-US"/>
+        </w:rPr>
+        <w:t>/202</w:t>
+      </w:r>
+      <w:r>
+        <w:rPr>
+          <w:rFonts w:ascii="Calibri" w:eastAsia="Calibri" w:hAnsi="Calibri" w:cs="Calibri"/>
+          <w:b/>
+          <w:sz w:val="22"/>
+          <w:szCs w:val="22"/>
+          <w:lang w:eastAsia="en-US"/>
+        </w:rPr>
+        <w:t>7</w:t>
       </w:r>
     </w:p>
     <w:bookmarkEnd w:id="0"/>
@@ -2180,6 +2210,7 @@
           <w:szCs w:val="22"/>
           <w:lang w:eastAsia="en-US"/>
         </w:rPr>
+        <w:lastRenderedPageBreak/>
         <w:t>consentire al tutor dell’Istituto di verificare l’andamento della formazione in contesto lavorativo, per coordinare l’intero percorso formativo e per la stesura della relazione finale;</w:t>
       </w:r>
     </w:p>
@@ -2991,6 +3022,7 @@
           <w:sz w:val="22"/>
           <w:szCs w:val="22"/>
         </w:rPr>
+        <w:lastRenderedPageBreak/>
         <w:t>A</w:t>
       </w:r>
       <w:r>
@@ -3790,7 +3822,7 @@
       <w:rPr>
         <w:noProof/>
       </w:rPr>
-      <w:pict w14:anchorId="2E6F77BC">
+      <w:pict w14:anchorId="100E03F0">
         <v:shapetype id="_x0000_t75" coordsize="21600,21600" o:spt="75" o:preferrelative="t" path="m@4@5l@4@11@9@11@9@5xe" filled="f" stroked="f">
           <v:stroke joinstyle="miter"/>
           <v:formulas>
@@ -3810,7 +3842,7 @@
           <v:path o:extrusionok="f" gradientshapeok="t" o:connecttype="rect"/>
           <o:lock v:ext="edit" aspectratio="t"/>
         </v:shapetype>
-        <v:shape id="_x0000_i1025" type="#_x0000_t75" style="width:188.4pt;height:43pt">
+        <v:shape id="_x0000_i1025" type="#_x0000_t75" style="width:189pt;height:42.75pt">
           <v:imagedata r:id="rId1" o:title="dip - biologia - per word"/>
         </v:shape>
       </w:pict>
@@ -4625,7 +4657,7 @@
       </w:pPr>
     </w:lvl>
   </w:abstractNum>
-  <w:num w:numId="1" w16cid:durableId="1417706340">
+  <w:num w:numId="1" w16cid:durableId="296765574">
     <w:abstractNumId w:val="1"/>
     <w:lvlOverride w:ilvl="0">
       <w:startOverride w:val="1"/>
@@ -4655,19 +4687,19 @@
       <w:startOverride w:val="1"/>
     </w:lvlOverride>
   </w:num>
-  <w:num w:numId="2" w16cid:durableId="1944878707">
+  <w:num w:numId="2" w16cid:durableId="1846745992">
     <w:abstractNumId w:val="1"/>
   </w:num>
-  <w:num w:numId="3" w16cid:durableId="1232933524">
+  <w:num w:numId="3" w16cid:durableId="1789811569">
     <w:abstractNumId w:val="5"/>
   </w:num>
-  <w:num w:numId="4" w16cid:durableId="1761945832">
+  <w:num w:numId="4" w16cid:durableId="1411851375">
     <w:abstractNumId w:val="6"/>
   </w:num>
-  <w:num w:numId="5" w16cid:durableId="283774145">
+  <w:num w:numId="5" w16cid:durableId="2142185446">
     <w:abstractNumId w:val="4"/>
   </w:num>
-  <w:num w:numId="6" w16cid:durableId="1835216980">
+  <w:num w:numId="6" w16cid:durableId="1687705641">
     <w:abstractNumId w:val="2"/>
     <w:lvlOverride w:ilvl="0"/>
     <w:lvlOverride w:ilvl="1"/>
@@ -4679,10 +4711,10 @@
     <w:lvlOverride w:ilvl="7"/>
     <w:lvlOverride w:ilvl="8"/>
   </w:num>
-  <w:num w:numId="7" w16cid:durableId="1421831762">
+  <w:num w:numId="7" w16cid:durableId="1536306585">
     <w:abstractNumId w:val="0"/>
   </w:num>
-  <w:num w:numId="8" w16cid:durableId="321199848">
+  <w:num w:numId="8" w16cid:durableId="2109691020">
     <w:abstractNumId w:val="3"/>
   </w:num>
 </w:numbering>

</xml_diff>

<commit_message>
Moduli: pannello per moduli (Orientamento con FSL, Prenotazioni e risorse, Didattica, Gestione del portale) con pagina iniziale, menu e abilitazioni per modulo; Prenotazioni e risorse: vista a calendario, aule collegate ai turni, ricevimento dei docenti; Didattica: modulistica e moduli online guidati, pratiche con iter per profili (manager, referente del corso, carriere, internazionalizzazione), attività, note interne, integrazioni e autodichiarazioni, Ufficio didattico dall'anagrafe con ricevimento, sedute del Consiglio con verbale in Word ed export Excel; FSL: Convenzione e Allegato A compilati online dalla scuola con logo e attività (schema v36)
</commit_message>
<xml_diff>
--- a/modelli_documenti/convenzione_precompilabile.docx
+++ b/modelli_documenti/convenzione_precompilabile.docx
@@ -118,11 +118,9 @@
           <w:szCs w:val="22"/>
         </w:rPr>
       </w:pPr>
-      <w:bookmarkStart w:id="1" w:name="_Hlk211439345"/>
       <w:r>
         <w:rPr>
           <w:rFonts w:ascii="Calibri" w:hAnsi="Calibri" w:cs="Calibri"/>
-          <w:color w:val="FF0000"/>
           <w:sz w:val="22"/>
           <w:szCs w:val="22"/>
           <w:highlight w:val="yellow"/>
@@ -132,7 +130,6 @@
       <w:r>
         <w:rPr>
           <w:rFonts w:ascii="Calibri" w:hAnsi="Calibri" w:cs="Calibri"/>
-          <w:color w:val="000000"/>
           <w:sz w:val="22"/>
           <w:szCs w:val="22"/>
         </w:rPr>
@@ -141,7 +138,6 @@
       <w:r>
         <w:rPr>
           <w:rFonts w:ascii="Calibri" w:hAnsi="Calibri" w:cs="Calibri"/>
-          <w:color w:val="FF0000"/>
           <w:sz w:val="22"/>
           <w:szCs w:val="22"/>
           <w:highlight w:val="yellow"/>
@@ -151,44 +147,91 @@
       <w:r>
         <w:rPr>
           <w:rFonts w:ascii="Calibri" w:hAnsi="Calibri" w:cs="Calibri"/>
-          <w:color w:val="000000"/>
-          <w:sz w:val="22"/>
-          <w:szCs w:val="22"/>
-        </w:rPr>
-        <w:t>,</w:t>
+          <w:sz w:val="22"/>
+          <w:szCs w:val="22"/>
+        </w:rPr>
+        <w:t xml:space="preserve">, </w:t>
       </w:r>
       <w:r>
         <w:rPr>
           <w:rFonts w:ascii="Calibri" w:hAnsi="Calibri" w:cs="Calibri"/>
-          <w:color w:val="000000"/>
-          <w:sz w:val="22"/>
-          <w:szCs w:val="22"/>
-        </w:rPr>
-        <w:t xml:space="preserve"> via </w:t>
+          <w:sz w:val="22"/>
+          <w:szCs w:val="22"/>
+          <w:highlight w:val="yellow"/>
+        </w:rPr>
+        <w:t xml:space="preserve">{{INDIRIZZO}}</w:t>
       </w:r>
       <w:r>
         <w:rPr>
           <w:rFonts w:ascii="Calibri" w:hAnsi="Calibri" w:cs="Calibri"/>
-          <w:color w:val="FF0000"/>
+          <w:sz w:val="22"/>
+          <w:szCs w:val="22"/>
+        </w:rPr>
+        <w:t xml:space="preserve">, codice fiscale </w:t>
+      </w:r>
+      <w:r>
+        <w:rPr>
+          <w:rFonts w:ascii="Calibri" w:hAnsi="Calibri" w:cs="Calibri"/>
           <w:sz w:val="22"/>
           <w:szCs w:val="22"/>
           <w:highlight w:val="yellow"/>
         </w:rPr>
-        <w:t xml:space="preserve">{{INDIRIZZO}}</w:t>
+        <w:t xml:space="preserve">{{CF_ISTITUTO}}</w:t>
       </w:r>
       <w:r>
         <w:rPr>
           <w:rFonts w:ascii="Calibri" w:hAnsi="Calibri" w:cs="Calibri"/>
-          <w:color w:val="000000"/>
-          <w:sz w:val="22"/>
-          <w:szCs w:val="22"/>
-        </w:rPr>
-        <w:t xml:space="preserve"> </w:t>
+          <w:sz w:val="22"/>
+          <w:szCs w:val="22"/>
+        </w:rPr>
+        <w:t xml:space="preserve">, d’ora in poi denominato “istituzione scolastica”, rappresentato dal/dalla Dirigente Scolastico/a, </w:t>
       </w:r>
       <w:r>
         <w:rPr>
           <w:rFonts w:ascii="Calibri" w:hAnsi="Calibri" w:cs="Calibri"/>
-          <w:color w:val="000000"/>
+          <w:sz w:val="22"/>
+          <w:szCs w:val="22"/>
+          <w:highlight w:val="yellow"/>
+        </w:rPr>
+        <w:t xml:space="preserve">{{DIRIGENTE}}</w:t>
+      </w:r>
+      <w:r>
+        <w:rPr>
+          <w:rFonts w:ascii="Calibri" w:hAnsi="Calibri" w:cs="Calibri"/>
+          <w:sz w:val="22"/>
+          <w:szCs w:val="22"/>
+        </w:rPr>
+        <w:t xml:space="preserve">, nata/o a </w:t>
+      </w:r>
+      <w:r>
+        <w:rPr>
+          <w:rFonts w:ascii="Calibri" w:hAnsi="Calibri" w:cs="Calibri"/>
+          <w:sz w:val="22"/>
+          <w:szCs w:val="22"/>
+          <w:highlight w:val="yellow"/>
+        </w:rPr>
+        <w:t xml:space="preserve">{{DIR_LUOGO_NASCITA}}</w:t>
+      </w:r>
+      <w:r>
+        <w:rPr>
+          <w:rFonts w:ascii="Calibri" w:hAnsi="Calibri" w:cs="Calibri"/>
+          <w:sz w:val="22"/>
+          <w:szCs w:val="22"/>
+        </w:rPr>
+        <w:t xml:space="preserve">, il </w:t>
+      </w:r>
+      <w:r>
+        <w:rPr>
+          <w:rFonts w:ascii="Calibri" w:hAnsi="Calibri" w:cs="Calibri"/>
+          <w:sz w:val="22"/>
+          <w:szCs w:val="22"/>
+          <w:highlight w:val="yellow"/>
+        </w:rPr>
+        <w:t xml:space="preserve">{{DIR_DATA_NASCITA}}</w:t>
+      </w:r>
+      <w:r>
+        <w:rPr>
+          <w:rFonts w:ascii="Calibri" w:hAnsi="Calibri" w:cs="Calibri"/>
           <w:sz w:val="22"/>
           <w:szCs w:val="22"/>
         </w:rPr>
@@ -197,187 +240,19 @@
       <w:r>
         <w:rPr>
           <w:rFonts w:ascii="Calibri" w:hAnsi="Calibri" w:cs="Calibri"/>
-          <w:color w:val="FF0000"/>
           <w:sz w:val="22"/>
           <w:szCs w:val="22"/>
           <w:highlight w:val="yellow"/>
         </w:rPr>
-        <w:t>xxxxxx</w:t>
+        <w:t xml:space="preserve">{{DIR_CF}}</w:t>
       </w:r>
       <w:r>
         <w:rPr>
           <w:rFonts w:ascii="Calibri" w:hAnsi="Calibri" w:cs="Calibri"/>
-          <w:color w:val="000000"/>
-          <w:sz w:val="22"/>
-          <w:szCs w:val="22"/>
-        </w:rPr>
-        <w:t xml:space="preserve"> </w:t>
-      </w:r>
-      <w:r>
-        <w:rPr>
-          <w:rFonts w:ascii="Calibri" w:hAnsi="Calibri" w:cs="Calibri"/>
-          <w:color w:val="000000"/>
-          <w:sz w:val="22"/>
-          <w:szCs w:val="22"/>
-        </w:rPr>
-        <w:t xml:space="preserve">, d’ora in poi denominato “istituzione scolastica”, rappresentato </w:t>
-      </w:r>
-      <w:r>
-        <w:rPr>
-          <w:rFonts w:ascii="Calibri" w:hAnsi="Calibri" w:cs="Calibri"/>
-          <w:color w:val="FF0000"/>
-          <w:sz w:val="22"/>
-          <w:szCs w:val="22"/>
-        </w:rPr>
-        <w:t>dal/dalla</w:t>
-      </w:r>
-      <w:r>
-        <w:rPr>
-          <w:rFonts w:ascii="Calibri" w:hAnsi="Calibri" w:cs="Calibri"/>
-          <w:color w:val="000000"/>
-          <w:sz w:val="22"/>
-          <w:szCs w:val="22"/>
-        </w:rPr>
-        <w:t xml:space="preserve"> Dirigente Scolastic</w:t>
-      </w:r>
-      <w:r>
-        <w:rPr>
-          <w:rFonts w:ascii="Calibri" w:hAnsi="Calibri" w:cs="Calibri"/>
-          <w:color w:val="000000"/>
-          <w:sz w:val="22"/>
-          <w:szCs w:val="22"/>
-        </w:rPr>
-        <w:t>o/a</w:t>
-      </w:r>
-      <w:r>
-        <w:rPr>
-          <w:rFonts w:ascii="Calibri" w:hAnsi="Calibri" w:cs="Calibri"/>
-          <w:color w:val="000000"/>
-          <w:sz w:val="22"/>
-          <w:szCs w:val="22"/>
-        </w:rPr>
-        <w:t xml:space="preserve">, </w:t>
-      </w:r>
-      <w:r>
-        <w:rPr>
-          <w:rFonts w:ascii="Calibri" w:hAnsi="Calibri" w:cs="Calibri"/>
-          <w:color w:val="FF0000"/>
-          <w:sz w:val="22"/>
-          <w:szCs w:val="22"/>
-          <w:highlight w:val="yellow"/>
-        </w:rPr>
-        <w:t xml:space="preserve">Dott./Dott.ssa xxxxxx </w:t>
-      </w:r>
-      <w:r>
-        <w:rPr>
-          <w:rFonts w:ascii="Calibri" w:hAnsi="Calibri" w:cs="Calibri"/>
-          <w:color w:val="FF0000"/>
-          <w:sz w:val="22"/>
-          <w:szCs w:val="22"/>
-          <w:highlight w:val="yellow"/>
-        </w:rPr>
-        <w:t>XXXX</w:t>
-      </w:r>
-      <w:r>
-        <w:rPr>
-          <w:rFonts w:ascii="Calibri" w:hAnsi="Calibri" w:cs="Calibri"/>
-          <w:color w:val="000000"/>
-          <w:sz w:val="22"/>
-          <w:szCs w:val="22"/>
-        </w:rPr>
-        <w:t>, nata</w:t>
-      </w:r>
-      <w:r>
-        <w:rPr>
-          <w:rFonts w:ascii="Calibri" w:hAnsi="Calibri" w:cs="Calibri"/>
-          <w:color w:val="000000"/>
-          <w:sz w:val="22"/>
-          <w:szCs w:val="22"/>
-        </w:rPr>
-        <w:t>/o</w:t>
-      </w:r>
-      <w:r>
-        <w:rPr>
-          <w:rFonts w:ascii="Calibri" w:hAnsi="Calibri" w:cs="Calibri"/>
-          <w:color w:val="000000"/>
-          <w:sz w:val="22"/>
-          <w:szCs w:val="22"/>
-        </w:rPr>
-        <w:t xml:space="preserve"> a </w:t>
-      </w:r>
-      <w:r>
-        <w:rPr>
-          <w:rFonts w:ascii="Calibri" w:hAnsi="Calibri" w:cs="Calibri"/>
-          <w:color w:val="FF0000"/>
-          <w:sz w:val="22"/>
-          <w:szCs w:val="22"/>
-          <w:highlight w:val="yellow"/>
-        </w:rPr>
-        <w:t>xxxx</w:t>
-      </w:r>
-      <w:r>
-        <w:rPr>
-          <w:rFonts w:ascii="Calibri" w:hAnsi="Calibri" w:cs="Calibri"/>
-          <w:color w:val="000000"/>
-          <w:sz w:val="22"/>
-          <w:szCs w:val="22"/>
-        </w:rPr>
-        <w:t xml:space="preserve">, il </w:t>
-      </w:r>
-      <w:r>
-        <w:rPr>
-          <w:rFonts w:ascii="Calibri" w:hAnsi="Calibri" w:cs="Calibri"/>
-          <w:color w:val="FF0000"/>
-          <w:sz w:val="22"/>
-          <w:szCs w:val="22"/>
-          <w:highlight w:val="yellow"/>
-        </w:rPr>
-        <w:t>xx/xx/xxxx</w:t>
-      </w:r>
-      <w:r>
-        <w:rPr>
-          <w:rFonts w:ascii="Calibri" w:hAnsi="Calibri" w:cs="Calibri"/>
-          <w:color w:val="FF0000"/>
-          <w:sz w:val="22"/>
-          <w:szCs w:val="22"/>
-        </w:rPr>
-        <w:t>,</w:t>
-      </w:r>
-      <w:r>
-        <w:rPr>
-          <w:rFonts w:ascii="Calibri" w:hAnsi="Calibri" w:cs="Calibri"/>
-          <w:color w:val="000000"/>
-          <w:sz w:val="22"/>
-          <w:szCs w:val="22"/>
-        </w:rPr>
-        <w:t xml:space="preserve"> codice fiscale </w:t>
-      </w:r>
-      <w:r>
-        <w:rPr>
-          <w:rFonts w:ascii="Calibri" w:hAnsi="Calibri" w:cs="Calibri"/>
-          <w:color w:val="FF0000"/>
-          <w:sz w:val="22"/>
-          <w:szCs w:val="22"/>
-          <w:highlight w:val="yellow"/>
-        </w:rPr>
-        <w:t>XXXXXXXXXXXXXXXXXXXXXX</w:t>
-      </w:r>
-      <w:r>
-        <w:rPr>
-          <w:rFonts w:ascii="Calibri" w:hAnsi="Calibri" w:cs="Calibri"/>
-          <w:color w:val="000000"/>
-          <w:sz w:val="22"/>
-          <w:szCs w:val="22"/>
-        </w:rPr>
-        <w:t>;</w:t>
-      </w:r>
-      <w:r>
-        <w:rPr>
-          <w:rFonts w:ascii="Calibri" w:hAnsi="Calibri" w:cs="Calibri"/>
-          <w:sz w:val="22"/>
-          <w:szCs w:val="22"/>
-        </w:rPr>
-        <w:t xml:space="preserve"> </w:t>
+          <w:sz w:val="22"/>
+          <w:szCs w:val="22"/>
+        </w:rPr>
+        <w:t xml:space="preserve">;</w:t>
       </w:r>
     </w:p>
     <w:p>
@@ -2819,32 +2694,10 @@
                 <w:b/>
                 <w:sz w:val="22"/>
                 <w:szCs w:val="22"/>
+                <w:lang w:eastAsia="en-US"/>
                 <w:highlight w:val="yellow"/>
-                <w:lang w:eastAsia="en-US"/>
               </w:rPr>
-              <w:t>Dott.</w:t>
-            </w:r>
-            <w:r>
-              <w:rPr>
-                <w:rFonts w:ascii="Calibri" w:eastAsia="Calibri" w:hAnsi="Calibri" w:cs="Calibri"/>
-                <w:b/>
-                <w:sz w:val="22"/>
-                <w:szCs w:val="22"/>
-                <w:highlight w:val="yellow"/>
-                <w:lang w:eastAsia="en-US"/>
-              </w:rPr>
-              <w:t>/Dott.ssa………………..</w:t>
-            </w:r>
-            <w:r>
-              <w:rPr>
-                <w:rFonts w:ascii="Calibri" w:eastAsia="Calibri" w:hAnsi="Calibri" w:cs="Calibri"/>
-                <w:b/>
-                <w:sz w:val="22"/>
-                <w:szCs w:val="22"/>
-                <w:highlight w:val="yellow"/>
-                <w:lang w:eastAsia="en-US"/>
-              </w:rPr>
-              <w:t xml:space="preserve"> </w:t>
+              <w:t xml:space="preserve">{{DIRIGENTE_FIRMA}}</w:t>
             </w:r>
           </w:p>
         </w:tc>

</xml_diff>